<commit_message>
Computed noise correlation for the whole populations
</commit_message>
<xml_diff>
--- a/decoding-analysis/meeting notes.docx
+++ b/decoding-analysis/meeting notes.docx
@@ -224,6 +224,60 @@
             </a:graphic>
           </wp:inline>
         </w:drawing>
+      </w:r>
+    </w:p>
+    <w:p>
+      <w:pPr>
+        <w:rPr>
+          <w:b/>
+          <w:bCs/>
+        </w:rPr>
+      </w:pPr>
+    </w:p>
+    <w:p>
+      <w:pPr>
+        <w:rPr>
+          <w:b/>
+          <w:bCs/>
+        </w:rPr>
+      </w:pPr>
+      <w:r>
+        <w:rPr>
+          <w:b/>
+          <w:bCs/>
+        </w:rPr>
+        <w:t>BEFORE and after shuffle mean noise correlation comparison</w:t>
+      </w:r>
+    </w:p>
+    <w:p>
+      <w:pPr>
+        <w:rPr>
+          <w:b/>
+          <w:bCs/>
+        </w:rPr>
+      </w:pPr>
+      <w:r>
+        <w:rPr>
+          <w:b/>
+          <w:bCs/>
+        </w:rPr>
+        <w:t xml:space="preserve">Distribution of delta </w:t>
+      </w:r>
+      <w:proofErr w:type="spellStart"/>
+      <w:r>
+        <w:rPr>
+          <w:b/>
+          <w:bCs/>
+        </w:rPr>
+        <w:t>nc</w:t>
+      </w:r>
+      <w:proofErr w:type="spellEnd"/>
+      <w:r>
+        <w:rPr>
+          <w:b/>
+          <w:bCs/>
+        </w:rPr>
+        <w:t>, combined or separate for within and across session neurons</w:t>
       </w:r>
     </w:p>
     <w:sectPr>

</xml_diff>

<commit_message>
Generate affine PT decoding figures
</commit_message>
<xml_diff>
--- a/decoding-analysis/meeting notes.docx
+++ b/decoding-analysis/meeting notes.docx
@@ -308,6 +308,120 @@
           <w:bCs/>
         </w:rPr>
         <w:t>4/9 Separate neurons by their sessions and then do analysis to show how noise correlation affects the metrics. One datapoint for one session, we got multiple datapoints.</w:t>
+      </w:r>
+    </w:p>
+    <w:p>
+      <w:pPr>
+        <w:rPr>
+          <w:b/>
+          <w:bCs/>
+        </w:rPr>
+      </w:pPr>
+      <w:r>
+        <w:rPr>
+          <w:b/>
+          <w:bCs/>
+        </w:rPr>
+        <w:br w:type="page"/>
+      </w:r>
+    </w:p>
+    <w:p>
+      <w:pPr>
+        <w:rPr>
+          <w:b/>
+          <w:bCs/>
+        </w:rPr>
+      </w:pPr>
+      <w:r>
+        <w:rPr>
+          <w:b/>
+          <w:bCs/>
+        </w:rPr>
+        <w:lastRenderedPageBreak/>
+        <w:drawing>
+          <wp:inline distT="0" distB="0" distL="0" distR="0" wp14:anchorId="2C385DF9" wp14:editId="02535ADF">
+            <wp:extent cx="5943600" cy="3343275"/>
+            <wp:effectExtent l="0" t="0" r="0" b="9525"/>
+            <wp:docPr id="1471154385" name="Picture 1"/>
+            <wp:cNvGraphicFramePr>
+              <a:graphicFrameLocks xmlns:a="http://schemas.openxmlformats.org/drawingml/2006/main" noChangeAspect="1"/>
+            </wp:cNvGraphicFramePr>
+            <a:graphic xmlns:a="http://schemas.openxmlformats.org/drawingml/2006/main">
+              <a:graphicData uri="http://schemas.openxmlformats.org/drawingml/2006/picture">
+                <pic:pic xmlns:pic="http://schemas.openxmlformats.org/drawingml/2006/picture">
+                  <pic:nvPicPr>
+                    <pic:cNvPr id="1471154385" name=""/>
+                    <pic:cNvPicPr/>
+                  </pic:nvPicPr>
+                  <pic:blipFill>
+                    <a:blip r:embed="rId7"/>
+                    <a:stretch>
+                      <a:fillRect/>
+                    </a:stretch>
+                  </pic:blipFill>
+                  <pic:spPr>
+                    <a:xfrm>
+                      <a:off x="0" y="0"/>
+                      <a:ext cx="5943600" cy="3343275"/>
+                    </a:xfrm>
+                    <a:prstGeom prst="rect">
+                      <a:avLst/>
+                    </a:prstGeom>
+                  </pic:spPr>
+                </pic:pic>
+              </a:graphicData>
+            </a:graphic>
+          </wp:inline>
+        </w:drawing>
+      </w:r>
+    </w:p>
+    <w:p>
+      <w:pPr>
+        <w:rPr>
+          <w:b/>
+          <w:bCs/>
+        </w:rPr>
+      </w:pPr>
+      <w:r>
+        <w:rPr>
+          <w:b/>
+          <w:bCs/>
+        </w:rPr>
+        <w:drawing>
+          <wp:inline distT="0" distB="0" distL="0" distR="0" wp14:anchorId="73EB0988" wp14:editId="4ED3ED22">
+            <wp:extent cx="5943600" cy="3957320"/>
+            <wp:effectExtent l="0" t="0" r="0" b="5080"/>
+            <wp:docPr id="947452535" name="Picture 1"/>
+            <wp:cNvGraphicFramePr>
+              <a:graphicFrameLocks xmlns:a="http://schemas.openxmlformats.org/drawingml/2006/main" noChangeAspect="1"/>
+            </wp:cNvGraphicFramePr>
+            <a:graphic xmlns:a="http://schemas.openxmlformats.org/drawingml/2006/main">
+              <a:graphicData uri="http://schemas.openxmlformats.org/drawingml/2006/picture">
+                <pic:pic xmlns:pic="http://schemas.openxmlformats.org/drawingml/2006/picture">
+                  <pic:nvPicPr>
+                    <pic:cNvPr id="947452535" name=""/>
+                    <pic:cNvPicPr/>
+                  </pic:nvPicPr>
+                  <pic:blipFill>
+                    <a:blip r:embed="rId8"/>
+                    <a:stretch>
+                      <a:fillRect/>
+                    </a:stretch>
+                  </pic:blipFill>
+                  <pic:spPr>
+                    <a:xfrm>
+                      <a:off x="0" y="0"/>
+                      <a:ext cx="5943600" cy="3957320"/>
+                    </a:xfrm>
+                    <a:prstGeom prst="rect">
+                      <a:avLst/>
+                    </a:prstGeom>
+                  </pic:spPr>
+                </pic:pic>
+              </a:graphicData>
+            </a:graphic>
+          </wp:inline>
+        </w:drawing>
       </w:r>
     </w:p>
     <w:sectPr>

</xml_diff>